<commit_message>
le template de base
</commit_message>
<xml_diff>
--- a/Rapport de projet AGL3.docx
+++ b/Rapport de projet AGL3.docx
@@ -10,16 +10,16 @@
         <mc:AlternateContent>
           <mc:Choice Requires="wps">
             <w:drawing>
-              <wp:anchor distT="0" distB="0" distL="114300" distR="114300" simplePos="0" relativeHeight="251663360" behindDoc="0" locked="0" layoutInCell="1" allowOverlap="1" wp14:anchorId="28ACEC16" wp14:editId="3BF906E3">
+              <wp:anchor distT="0" distB="0" distL="114300" distR="114300" simplePos="0" relativeHeight="251663360" behindDoc="0" locked="0" layoutInCell="1" allowOverlap="1" wp14:anchorId="28ACEC16" wp14:editId="252F87C2">
                 <wp:simplePos x="0" y="0"/>
                 <wp:positionH relativeFrom="column">
-                  <wp:posOffset>-287655</wp:posOffset>
+                  <wp:posOffset>-410845</wp:posOffset>
                 </wp:positionH>
                 <wp:positionV relativeFrom="paragraph">
-                  <wp:posOffset>109441</wp:posOffset>
+                  <wp:posOffset>122555</wp:posOffset>
                 </wp:positionV>
-                <wp:extent cx="2279236" cy="405516"/>
-                <wp:effectExtent l="0" t="0" r="0" b="0"/>
+                <wp:extent cx="2508250" cy="450850"/>
+                <wp:effectExtent l="0" t="0" r="0" b="6350"/>
                 <wp:wrapNone/>
                 <wp:docPr id="6" name="Text Box 6"/>
                 <wp:cNvGraphicFramePr/>
@@ -30,7 +30,7 @@
                       <wps:spPr>
                         <a:xfrm>
                           <a:off x="0" y="0"/>
-                          <a:ext cx="2279236" cy="405516"/>
+                          <a:ext cx="2508250" cy="450850"/>
                         </a:xfrm>
                         <a:prstGeom prst="rect">
                           <a:avLst/>
@@ -46,20 +46,23 @@
                             <w:pPr>
                               <w:jc w:val="center"/>
                               <w:rPr>
-                                <w:b/>
-                                <w:bCs/>
                                 <w:sz w:val="20"/>
                                 <w:szCs w:val="20"/>
                               </w:rPr>
                             </w:pPr>
                             <w:r>
                               <w:rPr>
-                                <w:b/>
-                                <w:bCs/>
                                 <w:sz w:val="20"/>
                                 <w:szCs w:val="20"/>
                               </w:rPr>
-                              <w:t>MINISTERE DE LA COMMUNICATION ET DE L'ÉCONOMIE NUMERIQUE</w:t>
+                              <w:t xml:space="preserve">MINISTERE DE LA </w:t>
+                            </w:r>
+                            <w:r>
+                              <w:rPr>
+                                <w:sz w:val="20"/>
+                                <w:szCs w:val="20"/>
+                              </w:rPr>
+                              <w:t>TRANSITION NUMERIQUE ET DE LA DIGITALISATION</w:t>
                             </w:r>
                           </w:p>
                         </w:txbxContent>
@@ -88,27 +91,30 @@
                 <v:stroke joinstyle="miter"/>
                 <v:path gradientshapeok="t" o:connecttype="rect"/>
               </v:shapetype>
-              <v:shape id="Text Box 6" o:spid="_x0000_s1026" type="#_x0000_t202" style="position:absolute;margin-left:-22.65pt;margin-top:8.6pt;width:179.45pt;height:31.95pt;z-index:251663360;visibility:visible;mso-wrap-style:square;mso-width-percent:0;mso-height-percent:0;mso-wrap-distance-left:9pt;mso-wrap-distance-top:0;mso-wrap-distance-right:9pt;mso-wrap-distance-bottom:0;mso-position-horizontal:absolute;mso-position-horizontal-relative:text;mso-position-vertical:absolute;mso-position-vertical-relative:text;mso-width-percent:0;mso-height-percent:0;mso-width-relative:margin;mso-height-relative:margin;v-text-anchor:top" o:gfxdata="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" filled="f" stroked="f" strokeweight=".5pt">
+              <v:shape id="Text Box 6" o:spid="_x0000_s1026" type="#_x0000_t202" style="position:absolute;margin-left:-32.35pt;margin-top:9.65pt;width:197.5pt;height:35.5pt;z-index:251663360;visibility:visible;mso-wrap-style:square;mso-width-percent:0;mso-height-percent:0;mso-wrap-distance-left:9pt;mso-wrap-distance-top:0;mso-wrap-distance-right:9pt;mso-wrap-distance-bottom:0;mso-position-horizontal:absolute;mso-position-horizontal-relative:text;mso-position-vertical:absolute;mso-position-vertical-relative:text;mso-width-percent:0;mso-height-percent:0;mso-width-relative:margin;mso-height-relative:margin;v-text-anchor:top" o:gfxdata="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" filled="f" stroked="f" strokeweight=".5pt">
                 <v:textbox>
                   <w:txbxContent>
                     <w:p>
                       <w:pPr>
                         <w:jc w:val="center"/>
                         <w:rPr>
-                          <w:b/>
-                          <w:bCs/>
                           <w:sz w:val="20"/>
                           <w:szCs w:val="20"/>
                         </w:rPr>
                       </w:pPr>
                       <w:r>
                         <w:rPr>
-                          <w:b/>
-                          <w:bCs/>
                           <w:sz w:val="20"/>
                           <w:szCs w:val="20"/>
                         </w:rPr>
-                        <w:t>MINISTERE DE LA COMMUNICATION ET DE L'ÉCONOMIE NUMERIQUE</w:t>
+                        <w:t xml:space="preserve">MINISTERE DE LA </w:t>
+                      </w:r>
+                      <w:r>
+                        <w:rPr>
+                          <w:sz w:val="20"/>
+                          <w:szCs w:val="20"/>
+                        </w:rPr>
+                        <w:t>TRANSITION NUMERIQUE ET DE LA DIGITALISATION</w:t>
                       </w:r>
                     </w:p>
                   </w:txbxContent>
@@ -1865,16 +1871,14 @@
           <w:sz w:val="26"/>
           <w:szCs w:val="26"/>
         </w:rPr>
-        <w:t xml:space="preserve"> qui répond aux besoins du festival "Doc à Tunis" et facilite son organisation. Cette démarche soulève plusieurs questions : Comment organiser efficacement les données des films, des projections et des membres du jury ? Quelles fonctionnalités l’application doit-elle offrir pour une gestion optimale ? Comment garantir une interface simple et intuitive pour les utilisateurs ? </w:t>
-      </w:r>
-      <w:r>
-        <w:rPr>
-          <w:b/>
-          <w:bCs/>
-          <w:sz w:val="26"/>
-          <w:szCs w:val="26"/>
-        </w:rPr>
-        <w:t>Pour répondre à ces interrogations, ce rapport présente une étude préalable, suivie d’une modélisation conceptuelle et technique, pour aboutir à la conception d'une application adaptée aux besoins du festival.</w:t>
+        <w:t xml:space="preserve"> qui répond aux besoins du festival "Doc à Tunis" et facilite son organisation. Cette démarche soulève plusieurs questions : Comment organiser efficacement les données des films, des projections et des membres du jury ? Quelles fonctionnalités l’application doit-elle offrir pour une gestion optimale ? Comment garantir une interface simple et intuitive pour les utilisateurs </w:t>
+      </w:r>
+      <w:r>
+        <w:rPr>
+          <w:sz w:val="26"/>
+          <w:szCs w:val="26"/>
+        </w:rPr>
+        <w:t>? Pour répondre à ces interrogations, ce rapport présente une étude préalable, suivie d’une modélisation conceptuelle et technique, pour aboutir à la conception d'une application adaptée aux besoins du festival.</w:t>
       </w:r>
     </w:p>
     <w:p>
@@ -3738,7 +3742,7 @@
           <w:noProof/>
         </w:rPr>
         <w:drawing>
-          <wp:anchor distT="0" distB="0" distL="114300" distR="114300" simplePos="0" relativeHeight="251661312" behindDoc="0" locked="0" layoutInCell="1" allowOverlap="1" wp14:anchorId="7ED06660" wp14:editId="091205CB">
+          <wp:anchor distT="0" distB="0" distL="114300" distR="114300" simplePos="0" relativeHeight="251661312" behindDoc="0" locked="0" layoutInCell="1" allowOverlap="1" wp14:anchorId="7ED06660" wp14:editId="06667DD4">
             <wp:simplePos x="0" y="0"/>
             <wp:positionH relativeFrom="column">
               <wp:posOffset>-436880</wp:posOffset>
@@ -3747,7 +3751,7 @@
               <wp:posOffset>173189</wp:posOffset>
             </wp:positionV>
             <wp:extent cx="6636385" cy="3952875"/>
-            <wp:effectExtent l="19050" t="19050" r="12065" b="28575"/>
+            <wp:effectExtent l="0" t="0" r="0" b="9525"/>
             <wp:wrapNone/>
             <wp:docPr id="4" name="Picture 4"/>
             <wp:cNvGraphicFramePr>
@@ -3785,12 +3789,7 @@
                     </a:prstGeom>
                     <a:noFill/>
                     <a:ln>
-                      <a:solidFill>
-                        <a:schemeClr val="tx2">
-                          <a:lumMod val="75000"/>
-                          <a:lumOff val="25000"/>
-                        </a:schemeClr>
-                      </a:solidFill>
+                      <a:noFill/>
                     </a:ln>
                   </pic:spPr>
                 </pic:pic>
@@ -4873,7 +4872,7 @@
           <w:noProof/>
         </w:rPr>
         <w:drawing>
-          <wp:anchor distT="0" distB="0" distL="114300" distR="114300" simplePos="0" relativeHeight="251678720" behindDoc="0" locked="0" layoutInCell="1" allowOverlap="1" wp14:anchorId="0592AEFB" wp14:editId="28766AE7">
+          <wp:anchor distT="0" distB="0" distL="114300" distR="114300" simplePos="0" relativeHeight="251678720" behindDoc="0" locked="0" layoutInCell="1" allowOverlap="1" wp14:anchorId="0592AEFB" wp14:editId="3DB874C4">
             <wp:simplePos x="0" y="0"/>
             <wp:positionH relativeFrom="column">
               <wp:posOffset>-430640</wp:posOffset>
@@ -4882,7 +4881,7 @@
               <wp:posOffset>221366</wp:posOffset>
             </wp:positionV>
             <wp:extent cx="6620910" cy="4659465"/>
-            <wp:effectExtent l="19050" t="19050" r="27940" b="27305"/>
+            <wp:effectExtent l="0" t="0" r="8890" b="8255"/>
             <wp:wrapNone/>
             <wp:docPr id="27" name="Picture 27"/>
             <wp:cNvGraphicFramePr>
@@ -4920,12 +4919,7 @@
                     </a:prstGeom>
                     <a:noFill/>
                     <a:ln>
-                      <a:solidFill>
-                        <a:schemeClr val="tx2">
-                          <a:lumMod val="75000"/>
-                          <a:lumOff val="25000"/>
-                        </a:schemeClr>
-                      </a:solidFill>
+                      <a:noFill/>
                     </a:ln>
                   </pic:spPr>
                 </pic:pic>
@@ -6216,7 +6210,7 @@
         </w:rPr>
         <w:lastRenderedPageBreak/>
         <w:drawing>
-          <wp:anchor distT="0" distB="0" distL="114300" distR="114300" simplePos="0" relativeHeight="251679744" behindDoc="0" locked="0" layoutInCell="1" allowOverlap="1" wp14:anchorId="45ED8F83" wp14:editId="1B728D35">
+          <wp:anchor distT="0" distB="0" distL="114300" distR="114300" simplePos="0" relativeHeight="251679744" behindDoc="0" locked="0" layoutInCell="1" allowOverlap="1" wp14:anchorId="45ED8F83" wp14:editId="5147C430">
             <wp:simplePos x="0" y="0"/>
             <wp:positionH relativeFrom="column">
               <wp:posOffset>-411480</wp:posOffset>
@@ -6225,7 +6219,7 @@
               <wp:posOffset>144449</wp:posOffset>
             </wp:positionV>
             <wp:extent cx="6598174" cy="4290557"/>
-            <wp:effectExtent l="19050" t="19050" r="12700" b="15240"/>
+            <wp:effectExtent l="0" t="0" r="0" b="0"/>
             <wp:wrapNone/>
             <wp:docPr id="30" name="Picture 30"/>
             <wp:cNvGraphicFramePr>
@@ -6263,12 +6257,7 @@
                     </a:prstGeom>
                     <a:noFill/>
                     <a:ln>
-                      <a:solidFill>
-                        <a:schemeClr val="tx2">
-                          <a:lumMod val="75000"/>
-                          <a:lumOff val="25000"/>
-                        </a:schemeClr>
-                      </a:solidFill>
+                      <a:noFill/>
                     </a:ln>
                   </pic:spPr>
                 </pic:pic>
@@ -7369,6 +7358,69 @@
     </w:p>
     <w:p>
       <w:pPr>
+        <w:jc w:val="both"/>
+        <w:rPr>
+          <w:sz w:val="26"/>
+          <w:szCs w:val="26"/>
+        </w:rPr>
+      </w:pPr>
+    </w:p>
+    <w:p>
+      <w:pPr>
+        <w:jc w:val="both"/>
+        <w:rPr>
+          <w:sz w:val="26"/>
+          <w:szCs w:val="26"/>
+        </w:rPr>
+      </w:pPr>
+    </w:p>
+    <w:p>
+      <w:pPr>
+        <w:jc w:val="both"/>
+        <w:rPr>
+          <w:sz w:val="26"/>
+          <w:szCs w:val="26"/>
+        </w:rPr>
+      </w:pPr>
+    </w:p>
+    <w:p>
+      <w:pPr>
+        <w:jc w:val="both"/>
+        <w:rPr>
+          <w:sz w:val="26"/>
+          <w:szCs w:val="26"/>
+        </w:rPr>
+      </w:pPr>
+    </w:p>
+    <w:p>
+      <w:pPr>
+        <w:jc w:val="both"/>
+        <w:rPr>
+          <w:sz w:val="26"/>
+          <w:szCs w:val="26"/>
+        </w:rPr>
+      </w:pPr>
+    </w:p>
+    <w:p>
+      <w:pPr>
+        <w:jc w:val="both"/>
+        <w:rPr>
+          <w:sz w:val="26"/>
+          <w:szCs w:val="26"/>
+        </w:rPr>
+      </w:pPr>
+    </w:p>
+    <w:p>
+      <w:pPr>
+        <w:jc w:val="both"/>
+        <w:rPr>
+          <w:sz w:val="26"/>
+          <w:szCs w:val="26"/>
+        </w:rPr>
+      </w:pPr>
+    </w:p>
+    <w:p>
+      <w:pPr>
         <w:jc w:val="center"/>
         <w:rPr>
           <w:b/>
@@ -7391,9 +7443,514 @@
           <w:sz w:val="26"/>
           <w:szCs w:val="26"/>
         </w:rPr>
-        <w:t xml:space="preserve"> Gestion des notes</w:t>
-      </w:r>
-    </w:p>
+        <w:t xml:space="preserve"> Gestion des note</w:t>
+      </w:r>
+      <w:r>
+        <w:rPr>
+          <w:b/>
+          <w:bCs/>
+          <w:sz w:val="26"/>
+          <w:szCs w:val="26"/>
+        </w:rPr>
+        <w:t>s</w:t>
+      </w:r>
+    </w:p>
+    <w:p>
+      <w:pPr>
+        <w:jc w:val="both"/>
+        <w:rPr>
+          <w:sz w:val="26"/>
+          <w:szCs w:val="26"/>
+        </w:rPr>
+      </w:pPr>
+      <w:r>
+        <w:rPr>
+          <w:noProof/>
+        </w:rPr>
+        <w:drawing>
+          <wp:anchor distT="0" distB="0" distL="114300" distR="114300" simplePos="0" relativeHeight="251681792" behindDoc="0" locked="0" layoutInCell="1" allowOverlap="1" wp14:anchorId="19BFFFC5" wp14:editId="575865EF">
+            <wp:simplePos x="0" y="0"/>
+            <wp:positionH relativeFrom="column">
+              <wp:posOffset>-239395</wp:posOffset>
+            </wp:positionH>
+            <wp:positionV relativeFrom="paragraph">
+              <wp:posOffset>341630</wp:posOffset>
+            </wp:positionV>
+            <wp:extent cx="6270707" cy="3829050"/>
+            <wp:effectExtent l="0" t="0" r="0" b="0"/>
+            <wp:wrapNone/>
+            <wp:docPr id="11" name="Picture 11"/>
+            <wp:cNvGraphicFramePr>
+              <a:graphicFrameLocks xmlns:a="http://schemas.openxmlformats.org/drawingml/2006/main" noChangeAspect="1"/>
+            </wp:cNvGraphicFramePr>
+            <a:graphic xmlns:a="http://schemas.openxmlformats.org/drawingml/2006/main">
+              <a:graphicData uri="http://schemas.openxmlformats.org/drawingml/2006/picture">
+                <pic:pic xmlns:pic="http://schemas.openxmlformats.org/drawingml/2006/picture">
+                  <pic:nvPicPr>
+                    <pic:cNvPr id="0" name="Picture 7"/>
+                    <pic:cNvPicPr>
+                      <a:picLocks noChangeAspect="1" noChangeArrowheads="1"/>
+                    </pic:cNvPicPr>
+                  </pic:nvPicPr>
+                  <pic:blipFill>
+                    <a:blip r:embed="rId13">
+                      <a:extLst>
+                        <a:ext uri="{28A0092B-C50C-407E-A947-70E740481C1C}">
+                          <a14:useLocalDpi xmlns:a14="http://schemas.microsoft.com/office/drawing/2010/main" val="0"/>
+                        </a:ext>
+                      </a:extLst>
+                    </a:blip>
+                    <a:srcRect/>
+                    <a:stretch>
+                      <a:fillRect/>
+                    </a:stretch>
+                  </pic:blipFill>
+                  <pic:spPr bwMode="auto">
+                    <a:xfrm>
+                      <a:off x="0" y="0"/>
+                      <a:ext cx="6270707" cy="3829050"/>
+                    </a:xfrm>
+                    <a:prstGeom prst="rect">
+                      <a:avLst/>
+                    </a:prstGeom>
+                    <a:noFill/>
+                    <a:ln>
+                      <a:noFill/>
+                    </a:ln>
+                  </pic:spPr>
+                </pic:pic>
+              </a:graphicData>
+            </a:graphic>
+            <wp14:sizeRelH relativeFrom="margin">
+              <wp14:pctWidth>0</wp14:pctWidth>
+            </wp14:sizeRelH>
+            <wp14:sizeRelV relativeFrom="margin">
+              <wp14:pctHeight>0</wp14:pctHeight>
+            </wp14:sizeRelV>
+          </wp:anchor>
+        </w:drawing>
+      </w:r>
+    </w:p>
+    <w:p>
+      <w:pPr>
+        <w:jc w:val="both"/>
+        <w:rPr>
+          <w:sz w:val="26"/>
+          <w:szCs w:val="26"/>
+        </w:rPr>
+      </w:pPr>
+    </w:p>
+    <w:p>
+      <w:pPr>
+        <w:jc w:val="both"/>
+        <w:rPr>
+          <w:sz w:val="26"/>
+          <w:szCs w:val="26"/>
+        </w:rPr>
+      </w:pPr>
+    </w:p>
+    <w:p>
+      <w:pPr>
+        <w:jc w:val="both"/>
+        <w:rPr>
+          <w:sz w:val="26"/>
+          <w:szCs w:val="26"/>
+        </w:rPr>
+      </w:pPr>
+    </w:p>
+    <w:p>
+      <w:pPr>
+        <w:jc w:val="both"/>
+        <w:rPr>
+          <w:sz w:val="26"/>
+          <w:szCs w:val="26"/>
+        </w:rPr>
+      </w:pPr>
+    </w:p>
+    <w:p>
+      <w:pPr>
+        <w:jc w:val="both"/>
+        <w:rPr>
+          <w:sz w:val="26"/>
+          <w:szCs w:val="26"/>
+        </w:rPr>
+      </w:pPr>
+    </w:p>
+    <w:p>
+      <w:pPr>
+        <w:jc w:val="both"/>
+        <w:rPr>
+          <w:sz w:val="26"/>
+          <w:szCs w:val="26"/>
+        </w:rPr>
+      </w:pPr>
+    </w:p>
+    <w:p>
+      <w:pPr>
+        <w:jc w:val="both"/>
+        <w:rPr>
+          <w:sz w:val="26"/>
+          <w:szCs w:val="26"/>
+        </w:rPr>
+      </w:pPr>
+    </w:p>
+    <w:p>
+      <w:pPr>
+        <w:jc w:val="both"/>
+        <w:rPr>
+          <w:sz w:val="26"/>
+          <w:szCs w:val="26"/>
+        </w:rPr>
+      </w:pPr>
+    </w:p>
+    <w:p>
+      <w:pPr>
+        <w:jc w:val="both"/>
+        <w:rPr>
+          <w:sz w:val="26"/>
+          <w:szCs w:val="26"/>
+        </w:rPr>
+      </w:pPr>
+    </w:p>
+    <w:p>
+      <w:pPr>
+        <w:jc w:val="both"/>
+        <w:rPr>
+          <w:sz w:val="26"/>
+          <w:szCs w:val="26"/>
+        </w:rPr>
+      </w:pPr>
+    </w:p>
+    <w:p>
+      <w:pPr>
+        <w:jc w:val="both"/>
+        <w:rPr>
+          <w:sz w:val="26"/>
+          <w:szCs w:val="26"/>
+        </w:rPr>
+      </w:pPr>
+    </w:p>
+    <w:p>
+      <w:pPr>
+        <w:jc w:val="both"/>
+        <w:rPr>
+          <w:sz w:val="26"/>
+          <w:szCs w:val="26"/>
+        </w:rPr>
+      </w:pPr>
+    </w:p>
+    <w:p>
+      <w:pPr>
+        <w:jc w:val="both"/>
+        <w:rPr>
+          <w:sz w:val="26"/>
+          <w:szCs w:val="26"/>
+        </w:rPr>
+      </w:pPr>
+    </w:p>
+    <w:p>
+      <w:pPr>
+        <w:jc w:val="center"/>
+        <w:rPr>
+          <w:sz w:val="26"/>
+          <w:szCs w:val="26"/>
+        </w:rPr>
+      </w:pPr>
+      <w:r>
+        <w:rPr>
+          <w:sz w:val="26"/>
+          <w:szCs w:val="26"/>
+        </w:rPr>
+        <w:t xml:space="preserve">DESCRIPTION TEXTUELLE : </w:t>
+      </w:r>
+      <w:r>
+        <w:rPr>
+          <w:b/>
+          <w:bCs/>
+          <w:sz w:val="26"/>
+          <w:szCs w:val="26"/>
+        </w:rPr>
+        <w:t>Gestion des notes</w:t>
+      </w:r>
+    </w:p>
+    <w:p>
+      <w:pPr>
+        <w:jc w:val="both"/>
+        <w:rPr>
+          <w:sz w:val="26"/>
+          <w:szCs w:val="26"/>
+        </w:rPr>
+      </w:pPr>
+    </w:p>
+    <w:p>
+      <w:pPr>
+        <w:jc w:val="both"/>
+        <w:rPr>
+          <w:sz w:val="26"/>
+          <w:szCs w:val="26"/>
+        </w:rPr>
+      </w:pPr>
+    </w:p>
+    <w:p>
+      <w:pPr>
+        <w:jc w:val="both"/>
+        <w:rPr>
+          <w:sz w:val="26"/>
+          <w:szCs w:val="26"/>
+        </w:rPr>
+      </w:pPr>
+    </w:p>
+    <w:tbl>
+      <w:tblPr>
+        <w:tblStyle w:val="TableGrid"/>
+        <w:tblW w:w="0" w:type="auto"/>
+        <w:tblLook w:val="04A0" w:firstRow="1" w:lastRow="0" w:firstColumn="1" w:lastColumn="0" w:noHBand="0" w:noVBand="1"/>
+      </w:tblPr>
+      <w:tblGrid>
+        <w:gridCol w:w="4531"/>
+        <w:gridCol w:w="4531"/>
+      </w:tblGrid>
+      <w:tr>
+        <w:tc>
+          <w:tcPr>
+            <w:tcW w:w="4531" w:type="dxa"/>
+          </w:tcPr>
+          <w:p>
+            <w:pPr>
+              <w:jc w:val="both"/>
+              <w:rPr>
+                <w:sz w:val="26"/>
+                <w:szCs w:val="26"/>
+              </w:rPr>
+            </w:pPr>
+          </w:p>
+        </w:tc>
+        <w:tc>
+          <w:tcPr>
+            <w:tcW w:w="4531" w:type="dxa"/>
+          </w:tcPr>
+          <w:p>
+            <w:pPr>
+              <w:jc w:val="both"/>
+              <w:rPr>
+                <w:sz w:val="26"/>
+                <w:szCs w:val="26"/>
+              </w:rPr>
+            </w:pPr>
+          </w:p>
+        </w:tc>
+      </w:tr>
+      <w:tr>
+        <w:tc>
+          <w:tcPr>
+            <w:tcW w:w="4531" w:type="dxa"/>
+          </w:tcPr>
+          <w:p>
+            <w:pPr>
+              <w:jc w:val="both"/>
+              <w:rPr>
+                <w:sz w:val="26"/>
+                <w:szCs w:val="26"/>
+              </w:rPr>
+            </w:pPr>
+          </w:p>
+        </w:tc>
+        <w:tc>
+          <w:tcPr>
+            <w:tcW w:w="4531" w:type="dxa"/>
+          </w:tcPr>
+          <w:p>
+            <w:pPr>
+              <w:jc w:val="both"/>
+              <w:rPr>
+                <w:sz w:val="26"/>
+                <w:szCs w:val="26"/>
+              </w:rPr>
+            </w:pPr>
+          </w:p>
+        </w:tc>
+      </w:tr>
+      <w:tr>
+        <w:tc>
+          <w:tcPr>
+            <w:tcW w:w="4531" w:type="dxa"/>
+          </w:tcPr>
+          <w:p>
+            <w:pPr>
+              <w:jc w:val="both"/>
+              <w:rPr>
+                <w:sz w:val="26"/>
+                <w:szCs w:val="26"/>
+              </w:rPr>
+            </w:pPr>
+          </w:p>
+        </w:tc>
+        <w:tc>
+          <w:tcPr>
+            <w:tcW w:w="4531" w:type="dxa"/>
+          </w:tcPr>
+          <w:p>
+            <w:pPr>
+              <w:jc w:val="both"/>
+              <w:rPr>
+                <w:sz w:val="26"/>
+                <w:szCs w:val="26"/>
+              </w:rPr>
+            </w:pPr>
+          </w:p>
+        </w:tc>
+      </w:tr>
+      <w:tr>
+        <w:tc>
+          <w:tcPr>
+            <w:tcW w:w="4531" w:type="dxa"/>
+          </w:tcPr>
+          <w:p>
+            <w:pPr>
+              <w:jc w:val="both"/>
+              <w:rPr>
+                <w:sz w:val="26"/>
+                <w:szCs w:val="26"/>
+              </w:rPr>
+            </w:pPr>
+          </w:p>
+        </w:tc>
+        <w:tc>
+          <w:tcPr>
+            <w:tcW w:w="4531" w:type="dxa"/>
+          </w:tcPr>
+          <w:p>
+            <w:pPr>
+              <w:jc w:val="both"/>
+              <w:rPr>
+                <w:sz w:val="26"/>
+                <w:szCs w:val="26"/>
+              </w:rPr>
+            </w:pPr>
+          </w:p>
+        </w:tc>
+      </w:tr>
+      <w:tr>
+        <w:tc>
+          <w:tcPr>
+            <w:tcW w:w="4531" w:type="dxa"/>
+          </w:tcPr>
+          <w:p>
+            <w:pPr>
+              <w:jc w:val="both"/>
+              <w:rPr>
+                <w:sz w:val="26"/>
+                <w:szCs w:val="26"/>
+              </w:rPr>
+            </w:pPr>
+          </w:p>
+        </w:tc>
+        <w:tc>
+          <w:tcPr>
+            <w:tcW w:w="4531" w:type="dxa"/>
+          </w:tcPr>
+          <w:p>
+            <w:pPr>
+              <w:jc w:val="both"/>
+              <w:rPr>
+                <w:sz w:val="26"/>
+                <w:szCs w:val="26"/>
+              </w:rPr>
+            </w:pPr>
+          </w:p>
+        </w:tc>
+      </w:tr>
+      <w:tr>
+        <w:tc>
+          <w:tcPr>
+            <w:tcW w:w="4531" w:type="dxa"/>
+          </w:tcPr>
+          <w:p>
+            <w:pPr>
+              <w:jc w:val="both"/>
+              <w:rPr>
+                <w:sz w:val="26"/>
+                <w:szCs w:val="26"/>
+              </w:rPr>
+            </w:pPr>
+          </w:p>
+        </w:tc>
+        <w:tc>
+          <w:tcPr>
+            <w:tcW w:w="4531" w:type="dxa"/>
+          </w:tcPr>
+          <w:p>
+            <w:pPr>
+              <w:jc w:val="both"/>
+              <w:rPr>
+                <w:sz w:val="26"/>
+                <w:szCs w:val="26"/>
+              </w:rPr>
+            </w:pPr>
+          </w:p>
+        </w:tc>
+      </w:tr>
+      <w:tr>
+        <w:tc>
+          <w:tcPr>
+            <w:tcW w:w="4531" w:type="dxa"/>
+          </w:tcPr>
+          <w:p>
+            <w:pPr>
+              <w:jc w:val="both"/>
+              <w:rPr>
+                <w:sz w:val="26"/>
+                <w:szCs w:val="26"/>
+              </w:rPr>
+            </w:pPr>
+          </w:p>
+        </w:tc>
+        <w:tc>
+          <w:tcPr>
+            <w:tcW w:w="4531" w:type="dxa"/>
+          </w:tcPr>
+          <w:p>
+            <w:pPr>
+              <w:jc w:val="both"/>
+              <w:rPr>
+                <w:sz w:val="26"/>
+                <w:szCs w:val="26"/>
+              </w:rPr>
+            </w:pPr>
+          </w:p>
+        </w:tc>
+      </w:tr>
+      <w:tr>
+        <w:tc>
+          <w:tcPr>
+            <w:tcW w:w="4531" w:type="dxa"/>
+          </w:tcPr>
+          <w:p>
+            <w:pPr>
+              <w:jc w:val="both"/>
+              <w:rPr>
+                <w:sz w:val="26"/>
+                <w:szCs w:val="26"/>
+              </w:rPr>
+            </w:pPr>
+          </w:p>
+        </w:tc>
+        <w:tc>
+          <w:tcPr>
+            <w:tcW w:w="4531" w:type="dxa"/>
+          </w:tcPr>
+          <w:p>
+            <w:pPr>
+              <w:jc w:val="both"/>
+              <w:rPr>
+                <w:sz w:val="26"/>
+                <w:szCs w:val="26"/>
+              </w:rPr>
+            </w:pPr>
+          </w:p>
+        </w:tc>
+      </w:tr>
+    </w:tbl>
     <w:p>
       <w:pPr>
         <w:jc w:val="both"/>
@@ -7610,7 +8167,7 @@
       </w:pPr>
     </w:p>
     <w:sectPr>
-      <w:footerReference w:type="default" r:id="rId13"/>
+      <w:footerReference w:type="default" r:id="rId14"/>
       <w:pgSz w:w="11906" w:h="16838"/>
       <w:pgMar w:top="1417" w:right="1417" w:bottom="1417" w:left="1417" w:header="708" w:footer="708" w:gutter="0"/>
       <w:pgBorders w:offsetFrom="page">

</xml_diff>